<commit_message>
fix(report): add Front Tires and Rear Tires rows to Claim Summary DOCX template
The token map was already generating COND_FRONT_TIRES_RATING/NOTES and
COND_REAR_TIRES_RATING/NOTES but the template had no matching rows.
Tire condition and tread depth now appear in downloaded reports.

Co-Authored-By: Claude Opus 4.6 <noreply@anthropic.com>
</commit_message>
<xml_diff>
--- a/claim_cipher_app/forms/summaries/CLAIM_SUMMARY_TEMPLATE.docx
+++ b/claim_cipher_app/forms/summaries/CLAIM_SUMMARY_TEMPLATE.docx
@@ -3157,6 +3157,206 @@
                 <w:szCs w:val="17"/>
               </w:rPr>
               <w:t xml:space="preserve">{{COND_TRANS_NOTES}}</w:t>
+            </w:r>
+          </w:p>
+        </w:tc>
+      </w:tr>
+      <w:tr>
+        <w:tc>
+          <w:tcPr>
+            <w:tcW w:type="dxa" w:w="2000"/>
+            <w:tcBorders>
+              <w:top w:val="single" w:color="CCCCCC" w:sz="1"/>
+              <w:left w:val="single" w:color="CCCCCC" w:sz="1"/>
+              <w:bottom w:val="single" w:color="CCCCCC" w:sz="1"/>
+              <w:right w:val="single" w:color="CCCCCC" w:sz="1"/>
+            </w:tcBorders>
+            <w:tcMar>
+              <w:top w:type="dxa" w:w="60"/>
+              <w:left w:type="dxa" w:w="120"/>
+              <w:bottom w:type="dxa" w:w="60"/>
+              <w:right w:type="dxa" w:w="120"/>
+            </w:tcMar>
+            <w:vAlign w:val="center"/>
+          </w:tcPr>
+          <w:p>
+            <w:pPr>
+              <w:spacing w:before="0" w:after="0"/>
+            </w:pPr>
+            <w:r>
+              <w:rPr>
+                <w:rFonts w:ascii="Arial" w:cs="Arial" w:eastAsia="Arial" w:hAnsi="Arial"/>
+                <w:b/>
+                <w:bCs/>
+                <w:color w:val="2C3E50"/>
+                <w:sz w:val="17"/>
+                <w:szCs w:val="17"/>
+              </w:rPr>
+              <w:t xml:space="preserve">Front Tires</w:t>
+            </w:r>
+          </w:p>
+        </w:tc>
+        <w:tc>
+          <w:tcPr>
+            <w:tcW w:type="dxa" w:w="1200"/>
+            <w:tcBorders>
+              <w:top w:val="single" w:color="CCCCCC" w:sz="1"/>
+              <w:left w:val="single" w:color="CCCCCC" w:sz="1"/>
+              <w:bottom w:val="single" w:color="CCCCCC" w:sz="1"/>
+              <w:right w:val="single" w:color="CCCCCC" w:sz="1"/>
+            </w:tcBorders>
+            <w:tcMar>
+              <w:top w:type="dxa" w:w="60"/>
+              <w:left w:type="dxa" w:w="120"/>
+              <w:bottom w:type="dxa" w:w="60"/>
+              <w:right w:type="dxa" w:w="120"/>
+            </w:tcMar>
+            <w:vAlign w:val="center"/>
+          </w:tcPr>
+          <w:p>
+            <w:pPr>
+              <w:spacing w:before="0" w:after="0"/>
+            </w:pPr>
+            <w:r>
+              <w:rPr>
+                <w:rFonts w:ascii="Arial" w:cs="Arial" w:eastAsia="Arial" w:hAnsi="Arial"/>
+                <w:color w:val="333333"/>
+                <w:sz w:val="17"/>
+                <w:szCs w:val="17"/>
+              </w:rPr>
+              <w:t xml:space="preserve">{{COND_FRONT_TIRES_RATING}}</w:t>
+            </w:r>
+          </w:p>
+        </w:tc>
+        <w:tc>
+          <w:tcPr>
+            <w:tcW w:type="dxa" w:w="6160"/>
+            <w:tcBorders>
+              <w:top w:val="single" w:color="CCCCCC" w:sz="1"/>
+              <w:left w:val="single" w:color="CCCCCC" w:sz="1"/>
+              <w:bottom w:val="single" w:color="CCCCCC" w:sz="1"/>
+              <w:right w:val="single" w:color="CCCCCC" w:sz="1"/>
+            </w:tcBorders>
+            <w:tcMar>
+              <w:top w:type="dxa" w:w="60"/>
+              <w:left w:type="dxa" w:w="120"/>
+              <w:bottom w:type="dxa" w:w="60"/>
+              <w:right w:type="dxa" w:w="120"/>
+            </w:tcMar>
+            <w:vAlign w:val="center"/>
+          </w:tcPr>
+          <w:p>
+            <w:pPr>
+              <w:spacing w:before="0" w:after="0"/>
+            </w:pPr>
+            <w:r>
+              <w:rPr>
+                <w:rFonts w:ascii="Arial" w:cs="Arial" w:eastAsia="Arial" w:hAnsi="Arial"/>
+                <w:color w:val="333333"/>
+                <w:sz w:val="17"/>
+                <w:szCs w:val="17"/>
+              </w:rPr>
+              <w:t xml:space="preserve">{{COND_FRONT_TIRES_NOTES}}</w:t>
+            </w:r>
+          </w:p>
+        </w:tc>
+      </w:tr>
+      <w:tr>
+        <w:tc>
+          <w:tcPr>
+            <w:tcW w:type="dxa" w:w="2000"/>
+            <w:tcBorders>
+              <w:top w:val="single" w:color="CCCCCC" w:sz="1"/>
+              <w:left w:val="single" w:color="CCCCCC" w:sz="1"/>
+              <w:bottom w:val="single" w:color="CCCCCC" w:sz="1"/>
+              <w:right w:val="single" w:color="CCCCCC" w:sz="1"/>
+            </w:tcBorders>
+            <w:tcMar>
+              <w:top w:type="dxa" w:w="60"/>
+              <w:left w:type="dxa" w:w="120"/>
+              <w:bottom w:type="dxa" w:w="60"/>
+              <w:right w:type="dxa" w:w="120"/>
+            </w:tcMar>
+            <w:vAlign w:val="center"/>
+          </w:tcPr>
+          <w:p>
+            <w:pPr>
+              <w:spacing w:before="0" w:after="0"/>
+            </w:pPr>
+            <w:r>
+              <w:rPr>
+                <w:rFonts w:ascii="Arial" w:cs="Arial" w:eastAsia="Arial" w:hAnsi="Arial"/>
+                <w:b/>
+                <w:bCs/>
+                <w:color w:val="2C3E50"/>
+                <w:sz w:val="17"/>
+                <w:szCs w:val="17"/>
+              </w:rPr>
+              <w:t xml:space="preserve">Rear Tires</w:t>
+            </w:r>
+          </w:p>
+        </w:tc>
+        <w:tc>
+          <w:tcPr>
+            <w:tcW w:type="dxa" w:w="1200"/>
+            <w:tcBorders>
+              <w:top w:val="single" w:color="CCCCCC" w:sz="1"/>
+              <w:left w:val="single" w:color="CCCCCC" w:sz="1"/>
+              <w:bottom w:val="single" w:color="CCCCCC" w:sz="1"/>
+              <w:right w:val="single" w:color="CCCCCC" w:sz="1"/>
+            </w:tcBorders>
+            <w:tcMar>
+              <w:top w:type="dxa" w:w="60"/>
+              <w:left w:type="dxa" w:w="120"/>
+              <w:bottom w:type="dxa" w:w="60"/>
+              <w:right w:type="dxa" w:w="120"/>
+            </w:tcMar>
+            <w:vAlign w:val="center"/>
+          </w:tcPr>
+          <w:p>
+            <w:pPr>
+              <w:spacing w:before="0" w:after="0"/>
+            </w:pPr>
+            <w:r>
+              <w:rPr>
+                <w:rFonts w:ascii="Arial" w:cs="Arial" w:eastAsia="Arial" w:hAnsi="Arial"/>
+                <w:color w:val="333333"/>
+                <w:sz w:val="17"/>
+                <w:szCs w:val="17"/>
+              </w:rPr>
+              <w:t xml:space="preserve">{{COND_REAR_TIRES_RATING}}</w:t>
+            </w:r>
+          </w:p>
+        </w:tc>
+        <w:tc>
+          <w:tcPr>
+            <w:tcW w:type="dxa" w:w="6160"/>
+            <w:tcBorders>
+              <w:top w:val="single" w:color="CCCCCC" w:sz="1"/>
+              <w:left w:val="single" w:color="CCCCCC" w:sz="1"/>
+              <w:bottom w:val="single" w:color="CCCCCC" w:sz="1"/>
+              <w:right w:val="single" w:color="CCCCCC" w:sz="1"/>
+            </w:tcBorders>
+            <w:tcMar>
+              <w:top w:type="dxa" w:w="60"/>
+              <w:left w:type="dxa" w:w="120"/>
+              <w:bottom w:type="dxa" w:w="60"/>
+              <w:right w:type="dxa" w:w="120"/>
+            </w:tcMar>
+            <w:vAlign w:val="center"/>
+          </w:tcPr>
+          <w:p>
+            <w:pPr>
+              <w:spacing w:before="0" w:after="0"/>
+            </w:pPr>
+            <w:r>
+              <w:rPr>
+                <w:rFonts w:ascii="Arial" w:cs="Arial" w:eastAsia="Arial" w:hAnsi="Arial"/>
+                <w:color w:val="333333"/>
+                <w:sz w:val="17"/>
+                <w:szCs w:val="17"/>
+              </w:rPr>
+              <w:t xml:space="preserve">{{COND_REAR_TIRES_NOTES}}</w:t>
             </w:r>
           </w:p>
         </w:tc>

</xml_diff>